<commit_message>
fix(onlyoffice): Check the bookmark of a reference at write time
A replace removes the bookmarks of the paragraphs it replaces: a link
kept to one of them went nowhere. The editor writes the text of a link
as it is, so the end of a link is found by its `]()`, and `[1]` gets a
marker.
</commit_message>
<xml_diff>
--- a/e2e/fixtures/scribe/crossref.docx
+++ b/e2e/fixtures/scribe/crossref.docx
@@ -70,6 +70,23 @@
         <w:t xml:space="preserve"> first.</w:t>
       </w:r>
     </w:p>
+    <w:p>
+      <w:r>
+        <w:t xml:space="preserve">See </w:t>
+      </w:r>
+      <w:hyperlink w:anchor="mynote" w:history="1">
+        <w:r>
+          <w:rPr>
+            <w:rStyle w:val="Hyperlink"/>
+            <w:b/>
+          </w:rPr>
+          <w:t xml:space="preserve">[1]</w:t>
+        </w:r>
+      </w:hyperlink>
+      <w:r>
+        <w:t xml:space="preserve">.</w:t>
+      </w:r>
+    </w:p>
     <w:sectPr/>
   </w:body>
 </w:document>

</xml_diff>